<commit_message>
all update, loupe activation for automation
</commit_message>
<xml_diff>
--- a/TSU_Platform_Growth_Plan.docx
+++ b/TSU_Platform_Growth_Plan.docx
@@ -9310,7 +9310,7 @@
                 <w:color w:val="1A1A1A"/>
                 <w:sz w:val="17"/>
               </w:rPr>
-              <w:t>Notion build queue row auto-created</w:t>
+              <w:t>Build row auto-created in builds</w:t>
             </w:r>
           </w:p>
         </w:tc>
@@ -9339,7 +9339,7 @@
                 <w:color w:val="1A1A1A"/>
                 <w:sz w:val="17"/>
               </w:rPr>
-              <w:t>Zapier → Notion</w:t>
+              <w:t>Edge function → Supabase</w:t>
             </w:r>
           </w:p>
         </w:tc>
@@ -16883,7 +16883,7 @@
           <w:i w:val="0"/>
           <w:sz w:val="20"/>
         </w:rPr>
-        <w:t>All 53 tasks from this plan have been created in the Notion database:</w:t>
+        <w:t>All 53 tasks from this plan are tracked in Supabase:</w:t>
       </w:r>
     </w:p>
     <w:tbl>
@@ -16924,7 +16924,7 @@
                 <w:color w:val="006EC9"/>
                 <w:sz w:val="20"/>
               </w:rPr>
-              <w:t xml:space="preserve">NOTION:  </w:t>
+              <w:t xml:space="preserve">WHERE:  </w:t>
             </w:r>
             <w:r>
               <w:rPr>
@@ -16932,7 +16932,7 @@
                 <w:color w:val="1A1A1A"/>
                 <w:sz w:val="20"/>
               </w:rPr>
-              <w:t>TSU Command Center → TSU Operations → Systems &amp; Projects (products) → TSU Platform Migration &amp; Growth Plan → TSU Platform Tasks database. Filter by Phase to see phase-specific views. Filter by Status = In Progress for active work.</w:t>
+              <w:t>TSU HQ → Projects and Tasks, backed by the Supabase tables projects and admin_tasks. Filter by phase for phase-specific views. Filter by status = in_progress for active work.</w:t>
             </w:r>
           </w:p>
         </w:tc>

</xml_diff>